<commit_message>
Upload all the new scripts and files
</commit_message>
<xml_diff>
--- a/Demand Planning Meeting.docx
+++ b/Demand Planning Meeting.docx
@@ -36,11 +36,6 @@
     </w:p>
     <w:p>
       <w:pPr>
-        <w:jc w:val="both"/>
-      </w:pPr>
-    </w:p>
-    <w:p>
-      <w:pPr>
         <w:rPr>
           <w:b/>
           <w:bCs/>
@@ -112,13 +107,7 @@
         <w:rPr>
           <w:lang w:val="pt-BR"/>
         </w:rPr>
-        <w:t>R:</w:t>
-      </w:r>
-      <w:r>
-        <w:rPr>
-          <w:lang w:val="pt-BR"/>
-        </w:rPr>
-        <w:t xml:space="preserve"> O nosso </w:t>
+        <w:t xml:space="preserve">R: O nosso </w:t>
       </w:r>
       <w:proofErr w:type="spellStart"/>
       <w:r>
@@ -534,73 +523,80 @@
         <w:rPr>
           <w:color w:val="EE0000"/>
         </w:rPr>
+        <w:t></w:t>
+      </w:r>
+      <w:r>
+        <w:rPr>
+          <w:color w:val="EE0000"/>
+          <w:lang w:val="pt-BR"/>
+        </w:rPr>
+        <w:t xml:space="preserve">  </w:t>
+      </w:r>
+      <w:r>
+        <w:rPr>
+          <w:b/>
+          <w:bCs/>
+          <w:color w:val="EE0000"/>
+          <w:lang w:val="pt-BR"/>
+        </w:rPr>
+        <w:t>Treinar</w:t>
+      </w:r>
+      <w:proofErr w:type="gramEnd"/>
+      <w:r>
+        <w:rPr>
+          <w:b/>
+          <w:bCs/>
+          <w:color w:val="EE0000"/>
+          <w:lang w:val="pt-BR"/>
+        </w:rPr>
+        <w:t xml:space="preserve"> por SKU-canal</w:t>
+      </w:r>
+      <w:r>
+        <w:rPr>
+          <w:color w:val="EE0000"/>
+          <w:lang w:val="pt-BR"/>
+        </w:rPr>
+        <w:t xml:space="preserve">: resolve o Problema 2 "de graça" como efeito colateral, e ainda ganha mais acurácia agregada (+4,5 </w:t>
+      </w:r>
+      <w:proofErr w:type="spellStart"/>
+      <w:r>
+        <w:rPr>
+          <w:color w:val="EE0000"/>
+          <w:lang w:val="pt-BR"/>
+        </w:rPr>
+        <w:t>p.p</w:t>
+      </w:r>
+      <w:proofErr w:type="spellEnd"/>
+      <w:r>
+        <w:rPr>
+          <w:color w:val="EE0000"/>
+          <w:lang w:val="pt-BR"/>
+        </w:rPr>
+        <w:t xml:space="preserve">. </w:t>
+      </w:r>
+      <w:proofErr w:type="spellStart"/>
+      <w:r>
+        <w:rPr>
+          <w:color w:val="EE0000"/>
+          <w:lang w:val="pt-BR"/>
+        </w:rPr>
+        <w:t>vs</w:t>
+      </w:r>
+      <w:proofErr w:type="spellEnd"/>
+      <w:r>
+        <w:rPr>
+          <w:color w:val="EE0000"/>
+          <w:lang w:val="pt-BR"/>
+        </w:rPr>
+        <w:t xml:space="preserve"> baseline) — mas exige 15 modelos, </w:t>
+      </w:r>
+      <w:r>
+        <w:rPr>
+          <w:color w:val="EE0000"/>
+          <w:lang w:val="pt-BR"/>
+        </w:rPr>
         <w:lastRenderedPageBreak/>
-        <w:t></w:t>
-      </w:r>
-      <w:r>
-        <w:rPr>
-          <w:color w:val="EE0000"/>
-          <w:lang w:val="pt-BR"/>
-        </w:rPr>
-        <w:t xml:space="preserve">  </w:t>
-      </w:r>
-      <w:r>
-        <w:rPr>
-          <w:b/>
-          <w:bCs/>
-          <w:color w:val="EE0000"/>
-          <w:lang w:val="pt-BR"/>
-        </w:rPr>
-        <w:t>Treinar</w:t>
-      </w:r>
-      <w:proofErr w:type="gramEnd"/>
-      <w:r>
-        <w:rPr>
-          <w:b/>
-          <w:bCs/>
-          <w:color w:val="EE0000"/>
-          <w:lang w:val="pt-BR"/>
-        </w:rPr>
-        <w:t xml:space="preserve"> por SKU-canal</w:t>
-      </w:r>
-      <w:r>
-        <w:rPr>
-          <w:color w:val="EE0000"/>
-          <w:lang w:val="pt-BR"/>
-        </w:rPr>
-        <w:t xml:space="preserve">: resolve o Problema 2 "de graça" como efeito colateral, e ainda ganha mais acurácia agregada (+4,5 </w:t>
-      </w:r>
-      <w:proofErr w:type="spellStart"/>
-      <w:r>
-        <w:rPr>
-          <w:color w:val="EE0000"/>
-          <w:lang w:val="pt-BR"/>
-        </w:rPr>
-        <w:t>p.p</w:t>
-      </w:r>
-      <w:proofErr w:type="spellEnd"/>
-      <w:r>
-        <w:rPr>
-          <w:color w:val="EE0000"/>
-          <w:lang w:val="pt-BR"/>
-        </w:rPr>
-        <w:t xml:space="preserve">. </w:t>
-      </w:r>
-      <w:proofErr w:type="spellStart"/>
-      <w:r>
-        <w:rPr>
-          <w:color w:val="EE0000"/>
-          <w:lang w:val="pt-BR"/>
-        </w:rPr>
-        <w:t>vs</w:t>
-      </w:r>
-      <w:proofErr w:type="spellEnd"/>
-      <w:r>
-        <w:rPr>
-          <w:color w:val="EE0000"/>
-          <w:lang w:val="pt-BR"/>
-        </w:rPr>
-        <w:t xml:space="preserve"> baseline) — mas exige 15 modelos, risco real de instabilidade em </w:t>
+        <w:t xml:space="preserve">risco real de instabilidade em </w:t>
       </w:r>
       <w:proofErr w:type="spellStart"/>
       <w:r>
@@ -970,7 +966,43 @@
           <w:szCs w:val="32"/>
           <w:lang w:val="pt-BR"/>
         </w:rPr>
-        <w:t xml:space="preserve"> (agrupa vários produtos num modelo só), você ganha volume de dado, mas em troca o modelo aprende um </w:t>
+        <w:t xml:space="preserve"> (agrupa vários produtos num modelo só), você ganha volume de dado, mas em troca o modelo aprende um padrão </w:t>
+      </w:r>
+      <w:r>
+        <w:rPr>
+          <w:b/>
+          <w:bCs/>
+          <w:sz w:val="32"/>
+          <w:szCs w:val="32"/>
+          <w:lang w:val="pt-BR"/>
+        </w:rPr>
+        <w:t>médio</w:t>
+      </w:r>
+      <w:r>
+        <w:rPr>
+          <w:sz w:val="32"/>
+          <w:szCs w:val="32"/>
+          <w:lang w:val="pt-BR"/>
+        </w:rPr>
+        <w:t xml:space="preserve">, que pode não servir bem pra nenhum produto específico. Quando você </w:t>
+      </w:r>
+      <w:r>
+        <w:rPr>
+          <w:b/>
+          <w:bCs/>
+          <w:sz w:val="32"/>
+          <w:szCs w:val="32"/>
+          <w:lang w:val="pt-BR"/>
+        </w:rPr>
+        <w:t>separa por SKU</w:t>
+      </w:r>
+      <w:r>
+        <w:rPr>
+          <w:sz w:val="32"/>
+          <w:szCs w:val="32"/>
+          <w:lang w:val="pt-BR"/>
+        </w:rPr>
+        <w:t xml:space="preserve">, o modelo </w:t>
       </w:r>
       <w:r>
         <w:rPr>
@@ -979,43 +1011,7 @@
           <w:lang w:val="pt-BR"/>
         </w:rPr>
         <w:lastRenderedPageBreak/>
-        <w:t xml:space="preserve">padrão </w:t>
-      </w:r>
-      <w:r>
-        <w:rPr>
-          <w:b/>
-          <w:bCs/>
-          <w:sz w:val="32"/>
-          <w:szCs w:val="32"/>
-          <w:lang w:val="pt-BR"/>
-        </w:rPr>
-        <w:t>médio</w:t>
-      </w:r>
-      <w:r>
-        <w:rPr>
-          <w:sz w:val="32"/>
-          <w:szCs w:val="32"/>
-          <w:lang w:val="pt-BR"/>
-        </w:rPr>
-        <w:t xml:space="preserve">, que pode não servir bem pra nenhum produto específico. Quando você </w:t>
-      </w:r>
-      <w:r>
-        <w:rPr>
-          <w:b/>
-          <w:bCs/>
-          <w:sz w:val="32"/>
-          <w:szCs w:val="32"/>
-          <w:lang w:val="pt-BR"/>
-        </w:rPr>
-        <w:t>separa por SKU</w:t>
-      </w:r>
-      <w:r>
-        <w:rPr>
-          <w:sz w:val="32"/>
-          <w:szCs w:val="32"/>
-          <w:lang w:val="pt-BR"/>
-        </w:rPr>
-        <w:t>, o modelo aprende exatamente o padrão daquele produto, mas com muito menos dado pra aprender com confiança.</w:t>
+        <w:t>aprende exatamente o padrão daquele produto, mas com muito menos dado pra aprender com confiança.</w:t>
       </w:r>
     </w:p>
     <w:p>
@@ -1380,7 +1376,6 @@
           <w:szCs w:val="32"/>
           <w:lang w:val="pt-BR"/>
         </w:rPr>
-        <w:lastRenderedPageBreak/>
         <w:t>Interpretabilidade</w:t>
       </w:r>
       <w:proofErr w:type="spellEnd"/>
@@ -1430,6 +1425,7 @@
           <w:szCs w:val="32"/>
           <w:lang w:val="pt-BR"/>
         </w:rPr>
+        <w:lastRenderedPageBreak/>
         <w:t>Mais alinhado com como o negócio realmente pensa (cada SKU tem seu próprio ciclo de vida, sazonalidade, elasticidade)</w:t>
       </w:r>
     </w:p>
@@ -1778,8 +1774,16 @@
           <w:szCs w:val="32"/>
           <w:lang w:val="pt-BR"/>
         </w:rPr>
+        <w:t xml:space="preserve">Não existe resposta universalmente certa — depende de qual erro dói mais pro negócio. Dado que o Problema 2 do case é justamente sobre confiança na </w:t>
+      </w:r>
+      <w:r>
+        <w:rPr>
+          <w:sz w:val="32"/>
+          <w:szCs w:val="32"/>
+          <w:lang w:val="pt-BR"/>
+        </w:rPr>
         <w:lastRenderedPageBreak/>
-        <w:t>Não existe resposta universalmente certa — depende de qual erro dói mais pro negócio. Dado que o Problema 2 do case é justamente sobre confiança na decomposição/</w:t>
+        <w:t>decomposição/</w:t>
       </w:r>
       <w:proofErr w:type="spellStart"/>
       <w:r>
@@ -1965,6 +1969,332 @@
           <w:lang w:val="pt-BR"/>
         </w:rPr>
       </w:pPr>
+    </w:p>
+    <w:p>
+      <w:pPr>
+        <w:pStyle w:val="PargrafodaLista"/>
+        <w:rPr>
+          <w:sz w:val="32"/>
+          <w:szCs w:val="32"/>
+          <w:lang w:val="pt-BR"/>
+        </w:rPr>
+      </w:pPr>
+    </w:p>
+    <w:p>
+      <w:pPr>
+        <w:pStyle w:val="PargrafodaLista"/>
+        <w:rPr>
+          <w:sz w:val="32"/>
+          <w:szCs w:val="32"/>
+          <w:lang w:val="pt-BR"/>
+        </w:rPr>
+      </w:pPr>
+    </w:p>
+    <w:p>
+      <w:pPr>
+        <w:pStyle w:val="PargrafodaLista"/>
+        <w:rPr>
+          <w:sz w:val="32"/>
+          <w:szCs w:val="32"/>
+          <w:lang w:val="pt-BR"/>
+        </w:rPr>
+      </w:pPr>
+    </w:p>
+    <w:p>
+      <w:pPr>
+        <w:pStyle w:val="PargrafodaLista"/>
+        <w:rPr>
+          <w:sz w:val="32"/>
+          <w:szCs w:val="32"/>
+          <w:lang w:val="pt-BR"/>
+        </w:rPr>
+      </w:pPr>
+    </w:p>
+    <w:p>
+      <w:pPr>
+        <w:pStyle w:val="PargrafodaLista"/>
+        <w:rPr>
+          <w:sz w:val="32"/>
+          <w:szCs w:val="32"/>
+          <w:lang w:val="pt-BR"/>
+        </w:rPr>
+      </w:pPr>
+    </w:p>
+    <w:p>
+      <w:pPr>
+        <w:pStyle w:val="PargrafodaLista"/>
+        <w:rPr>
+          <w:sz w:val="32"/>
+          <w:szCs w:val="32"/>
+          <w:lang w:val="pt-BR"/>
+        </w:rPr>
+      </w:pPr>
+    </w:p>
+    <w:p>
+      <w:pPr>
+        <w:pStyle w:val="PargrafodaLista"/>
+        <w:rPr>
+          <w:sz w:val="32"/>
+          <w:szCs w:val="32"/>
+          <w:lang w:val="pt-BR"/>
+        </w:rPr>
+      </w:pPr>
+    </w:p>
+    <w:p>
+      <w:pPr>
+        <w:pStyle w:val="PargrafodaLista"/>
+        <w:rPr>
+          <w:sz w:val="32"/>
+          <w:szCs w:val="32"/>
+          <w:lang w:val="pt-BR"/>
+        </w:rPr>
+      </w:pPr>
+    </w:p>
+    <w:p>
+      <w:pPr>
+        <w:pStyle w:val="PargrafodaLista"/>
+        <w:rPr>
+          <w:sz w:val="32"/>
+          <w:szCs w:val="32"/>
+          <w:lang w:val="pt-BR"/>
+        </w:rPr>
+      </w:pPr>
+    </w:p>
+    <w:p>
+      <w:pPr>
+        <w:pStyle w:val="PargrafodaLista"/>
+        <w:rPr>
+          <w:sz w:val="32"/>
+          <w:szCs w:val="32"/>
+          <w:lang w:val="pt-BR"/>
+        </w:rPr>
+      </w:pPr>
+    </w:p>
+    <w:p>
+      <w:pPr>
+        <w:pStyle w:val="PargrafodaLista"/>
+        <w:ind w:left="0"/>
+        <w:rPr>
+          <w:sz w:val="32"/>
+          <w:szCs w:val="32"/>
+        </w:rPr>
+      </w:pPr>
+      <w:r>
+        <w:rPr>
+          <w:b/>
+          <w:bCs/>
+          <w:sz w:val="32"/>
+          <w:szCs w:val="32"/>
+        </w:rPr>
+        <w:lastRenderedPageBreak/>
+        <w:t xml:space="preserve">Problem 2: Poor Interpretability of the Forecast Decomposition </w:t>
+      </w:r>
+    </w:p>
+    <w:p>
+      <w:pPr>
+        <w:pStyle w:val="PargrafodaLista"/>
+        <w:ind w:left="0"/>
+        <w:rPr>
+          <w:sz w:val="32"/>
+          <w:szCs w:val="32"/>
+        </w:rPr>
+      </w:pPr>
+      <w:r>
+        <w:rPr>
+          <w:sz w:val="32"/>
+          <w:szCs w:val="32"/>
+        </w:rPr>
+        <w:t xml:space="preserve">The commercial team uses the model's decomposition to make trade marketing investment decisions. However, structural inconsistencies have been detected: </w:t>
+      </w:r>
+    </w:p>
+    <w:p>
+      <w:pPr>
+        <w:pStyle w:val="PargrafodaLista"/>
+        <w:ind w:left="0"/>
+        <w:rPr>
+          <w:sz w:val="32"/>
+          <w:szCs w:val="32"/>
+        </w:rPr>
+      </w:pPr>
+      <w:r>
+        <w:rPr>
+          <w:b/>
+          <w:bCs/>
+          <w:sz w:val="32"/>
+          <w:szCs w:val="32"/>
+        </w:rPr>
+        <w:t xml:space="preserve">1. </w:t>
+      </w:r>
+      <w:r>
+        <w:rPr>
+          <w:sz w:val="32"/>
+          <w:szCs w:val="32"/>
+        </w:rPr>
+        <w:t xml:space="preserve">The "Price" variable shows a positive contribution to volume in the Supermarkets channel for Natural Juice 1 L, which contradicts economic logic (price-demand elasticity should be negative). </w:t>
+      </w:r>
+    </w:p>
+    <w:p>
+      <w:pPr>
+        <w:pStyle w:val="PargrafodaLista"/>
+        <w:ind w:left="0"/>
+        <w:rPr>
+          <w:sz w:val="32"/>
+          <w:szCs w:val="32"/>
+        </w:rPr>
+      </w:pPr>
+      <w:r>
+        <w:rPr>
+          <w:b/>
+          <w:bCs/>
+          <w:sz w:val="32"/>
+          <w:szCs w:val="32"/>
+        </w:rPr>
+        <w:t xml:space="preserve">2. </w:t>
+      </w:r>
+      <w:r>
+        <w:rPr>
+          <w:sz w:val="32"/>
+          <w:szCs w:val="32"/>
+        </w:rPr>
+        <w:t xml:space="preserve">The "Promotions" variable captures a disproportionate effect (40% of explained variation) in E-commerce, when the real primary driver is Advertising Investment, which should not exceed 20% of the base. </w:t>
+      </w:r>
+    </w:p>
+    <w:p>
+      <w:pPr>
+        <w:pStyle w:val="PargrafodaLista"/>
+        <w:rPr>
+          <w:color w:val="EE0000"/>
+          <w:sz w:val="32"/>
+          <w:szCs w:val="32"/>
+          <w:lang w:val="pt-BR"/>
+        </w:rPr>
+      </w:pPr>
+      <w:r>
+        <w:rPr>
+          <w:i/>
+          <w:iCs/>
+          <w:color w:val="EE0000"/>
+          <w:sz w:val="32"/>
+          <w:szCs w:val="32"/>
+          <w:lang w:val="pt-BR"/>
+        </w:rPr>
+        <w:t xml:space="preserve">"O modelo atual atribui um peso desproporcional à Promoção, e isso é consistente com a observação real do time comercial (investimento de +35% sem retorno). Mas quando testamos rigorosamente com regressão controlada, nem Promoção nem Publicidade mostram efeito estatisticamente significativo — sugerindo que o problema não é só 'o modelo está enviesado para Promoção', é que </w:t>
+      </w:r>
+      <w:r>
+        <w:rPr>
+          <w:b/>
+          <w:bCs/>
+          <w:i/>
+          <w:iCs/>
+          <w:color w:val="EE0000"/>
+          <w:sz w:val="32"/>
+          <w:szCs w:val="32"/>
+          <w:lang w:val="pt-BR"/>
+        </w:rPr>
+        <w:t xml:space="preserve">o </w:t>
+      </w:r>
+      <w:proofErr w:type="spellStart"/>
+      <w:r>
+        <w:rPr>
+          <w:b/>
+          <w:bCs/>
+          <w:i/>
+          <w:iCs/>
+          <w:color w:val="EE0000"/>
+          <w:sz w:val="32"/>
+          <w:szCs w:val="32"/>
+          <w:lang w:val="pt-BR"/>
+        </w:rPr>
+        <w:t>dataset</w:t>
+      </w:r>
+      <w:proofErr w:type="spellEnd"/>
+      <w:r>
+        <w:rPr>
+          <w:b/>
+          <w:bCs/>
+          <w:i/>
+          <w:iCs/>
+          <w:color w:val="EE0000"/>
+          <w:sz w:val="32"/>
+          <w:szCs w:val="32"/>
+          <w:lang w:val="pt-BR"/>
+        </w:rPr>
+        <w:t xml:space="preserve"> atual não tem variação suficiente pra sustentar decisão de alocação de budget entre essas duas alavancas com confiança</w:t>
+      </w:r>
+      <w:r>
+        <w:rPr>
+          <w:i/>
+          <w:iCs/>
+          <w:color w:val="EE0000"/>
+          <w:sz w:val="32"/>
+          <w:szCs w:val="32"/>
+          <w:lang w:val="pt-BR"/>
+        </w:rPr>
+        <w:t>, seja lá qual for a direção."</w:t>
+      </w:r>
+    </w:p>
+    <w:p>
+      <w:pPr>
+        <w:pStyle w:val="PargrafodaLista"/>
+        <w:ind w:left="0"/>
+        <w:rPr>
+          <w:sz w:val="32"/>
+          <w:szCs w:val="32"/>
+          <w:lang w:val="pt-BR"/>
+        </w:rPr>
+      </w:pPr>
+    </w:p>
+    <w:p>
+      <w:pPr>
+        <w:pStyle w:val="PargrafodaLista"/>
+        <w:ind w:left="0"/>
+        <w:rPr>
+          <w:sz w:val="32"/>
+          <w:szCs w:val="32"/>
+        </w:rPr>
+      </w:pPr>
+      <w:r>
+        <w:rPr>
+          <w:b/>
+          <w:bCs/>
+          <w:sz w:val="32"/>
+          <w:szCs w:val="32"/>
+        </w:rPr>
+        <w:t xml:space="preserve">3. </w:t>
+      </w:r>
+      <w:r>
+        <w:rPr>
+          <w:sz w:val="32"/>
+          <w:szCs w:val="32"/>
+        </w:rPr>
+        <w:t xml:space="preserve">The commercial team increased promotional investment in E-commerce by 35% three months ago without achieving incremental returns. </w:t>
+      </w:r>
+    </w:p>
+    <w:p>
+      <w:pPr>
+        <w:pStyle w:val="PargrafodaLista"/>
+        <w:ind w:left="0"/>
+        <w:rPr>
+          <w:sz w:val="32"/>
+          <w:szCs w:val="32"/>
+        </w:rPr>
+      </w:pPr>
+      <w:r>
+        <w:rPr>
+          <w:b/>
+          <w:bCs/>
+          <w:sz w:val="32"/>
+          <w:szCs w:val="32"/>
+        </w:rPr>
+        <w:t xml:space="preserve">4. </w:t>
+      </w:r>
+      <w:r>
+        <w:rPr>
+          <w:sz w:val="32"/>
+          <w:szCs w:val="32"/>
+        </w:rPr>
+        <w:t>Three months ago, the price of Natural Juice in Supermarkets was reduced expecting a small effect on demand, which turned out to be null.</w:t>
+      </w:r>
     </w:p>
     <w:sectPr>
       <w:pgSz w:w="11906" w:h="16838"/>

</xml_diff>